<commit_message>
Rebuild Chapter 3 product under Grade 4 standards (v1.3)
Fix spec (blankCount, N2 revealSequence, quiz Q4/Q7), remove all stale 'infer' wording, teach Reader p.15 steeper-ramp fact, add fair-test controls + guided reasoning + average column to Ramp It Up, correct practice/quiz/recovery prompts, fix slide chip labels and N2/N3 slide text. Add blind source derivation and Chapters 4-7 read-only preflight.

Co-authored-by: Cursor <cursoragent@cursor.com>
</commit_message>
<xml_diff>
--- a/production/premium-notes/03-ch3-energy-speed-guided-notes-key.docx
+++ b/production/premium-notes/03-ch3-energy-speed-guided-notes-key.docx
@@ -821,7 +821,7 @@
           <w:u w:val="none"/>
           <w:rFonts w:ascii="Avenir Next" w:hAnsi="Avenir Next" w:cs="Avenir Next"/>
         </w:rPr>
-        <w:t>Reader p. 13-14</w:t>
+        <w:t>Reader p. TG Lesson 4</w:t>
       </w:r>
     </w:p>
     <w:p>
@@ -879,7 +879,7 @@
           <w:u w:val="none"/>
           <w:rFonts w:ascii="Avenir Next" w:hAnsi="Avenir Next" w:cs="Avenir Next"/>
         </w:rPr>
-        <w:t xml:space="preserve">We </w:t>
+        <w:t xml:space="preserve">We measure how far the </w:t>
       </w:r>
       <w:r>
         <w:rPr>
@@ -891,7 +891,7 @@
           <w:u w:val="none"/>
           <w:rFonts w:ascii="Avenir Next" w:hAnsi="Avenir Next" w:cs="Avenir Next"/>
         </w:rPr>
-        <w:t>infer</w:t>
+        <w:t>cup</w:t>
       </w:r>
       <w:r>
         <w:rPr>
@@ -903,7 +903,24 @@
           <w:u w:val="none"/>
           <w:rFonts w:ascii="Avenir Next" w:hAnsi="Avenir Next" w:cs="Avenir Next"/>
         </w:rPr>
-        <w:t xml:space="preserve"> the speed relationship from that change. We do not measure a speed number.</w:t>
+        <w:t xml:space="preserve"> moves in centimeters.</w:t>
+      </w:r>
+    </w:p>
+    <w:p>
+      <w:pPr>
+        <w:spacing w:before="0" w:after="80"/>
+      </w:pPr>
+      <w:r>
+        <w:rPr>
+          <w:rFonts w:ascii="Avenir Next" w:hAnsi="Avenir Next"/>
+          <w:b w:val="0"/>
+          <w:i w:val="0"/>
+          <w:color w:val="1A1D26"/>
+          <w:sz w:val="28"/>
+          <w:u w:val="none"/>
+          <w:rFonts w:ascii="Avenir Next" w:hAnsi="Avenir Next" w:cs="Avenir Next"/>
+        </w:rPr>
+        <w:t>We do not measure a speed number.</w:t>
       </w:r>
     </w:p>
     <w:p>
@@ -1282,6 +1299,47 @@
           <w:rFonts w:ascii="Avenir Next" w:hAnsi="Avenir Next" w:cs="Avenir Next"/>
         </w:rPr>
         <w:t>Reader p. 15</w:t>
+      </w:r>
+    </w:p>
+    <w:p>
+      <w:pPr>
+        <w:spacing w:before="0" w:after="120" w:line="520" w:lineRule="exact"/>
+      </w:pPr>
+      <w:r>
+        <w:rPr>
+          <w:rFonts w:ascii="Avenir Next" w:hAnsi="Avenir Next"/>
+          <w:b w:val="0"/>
+          <w:i w:val="0"/>
+          <w:color w:val="1A1D26"/>
+          <w:sz w:val="28"/>
+          <w:u w:val="none"/>
+          <w:rFonts w:ascii="Avenir Next" w:hAnsi="Avenir Next" w:cs="Avenir Next"/>
+        </w:rPr>
+        <w:t xml:space="preserve">Objects pick up more </w:t>
+      </w:r>
+      <w:r>
+        <w:rPr>
+          <w:rFonts w:ascii="Avenir Next" w:hAnsi="Avenir Next"/>
+          <w:b/>
+          <w:i w:val="0"/>
+          <w:color w:val="2B2F36"/>
+          <w:sz w:val="28"/>
+          <w:u w:val="none"/>
+          <w:rFonts w:ascii="Avenir Next" w:hAnsi="Avenir Next" w:cs="Avenir Next"/>
+        </w:rPr>
+        <w:t>speed</w:t>
+      </w:r>
+      <w:r>
+        <w:rPr>
+          <w:rFonts w:ascii="Avenir Next" w:hAnsi="Avenir Next"/>
+          <w:b w:val="0"/>
+          <w:i w:val="0"/>
+          <w:color w:val="1A1D26"/>
+          <w:sz w:val="28"/>
+          <w:u w:val="none"/>
+          <w:rFonts w:ascii="Avenir Next" w:hAnsi="Avenir Next" w:cs="Avenir Next"/>
+        </w:rPr>
+        <w:t xml:space="preserve"> on steeper ramps.</w:t>
       </w:r>
     </w:p>
     <w:p>

</xml_diff>